<commit_message>
Review Datasheeet form button and Layout Fixes for generaetd documents,Prefilled values from DB changed
</commit_message>
<xml_diff>
--- a/datasheet_gen/word_templates/CRF.docx
+++ b/datasheet_gen/word_templates/CRF.docx
@@ -433,6 +433,7 @@
       <w:tr>
         <w:trPr>
           <w:trHeight w:val="737"/>
+          <w:tblHeader/>
         </w:trPr>
         <w:tc>
           <w:tcPr>
@@ -1339,7 +1340,7 @@
           <w:p>
             <w:r/>
             <w:r>
-              <w:t>{{ test_port }}</w:t>
+              <w:t>{{ test_port_col_1 }}</w:t>
             </w:r>
           </w:p>
         </w:tc>
@@ -1350,7 +1351,9 @@
           </w:tcPr>
           <w:p>
             <w:r/>
-            <w:r/>
+            <w:r>
+              <w:t>{{ test_port_col_2 }}</w:t>
+            </w:r>
           </w:p>
         </w:tc>
       </w:tr>
@@ -1388,7 +1391,7 @@
           <w:p>
             <w:r/>
             <w:r>
-              <w:t>{{ coupling_method }}</w:t>
+              <w:t>{{ coupling_method_col_1 }}</w:t>
             </w:r>
           </w:p>
         </w:tc>
@@ -1399,7 +1402,9 @@
           </w:tcPr>
           <w:p>
             <w:r/>
-            <w:r/>
+            <w:r>
+              <w:t>{{ coupling_method_col_2 }}</w:t>
+            </w:r>
           </w:p>
         </w:tc>
       </w:tr>
@@ -1435,9 +1440,186 @@
             <w:vAlign w:val="center"/>
           </w:tcPr>
           <w:p>
-            <w:r/>
-            <w:r>
-              <w:t>{{ test_level }}</w:t>
+            <w:pPr>
+              <w:spacing w:line="276" w:lineRule="auto"/>
+              <w:rPr>
+                <w:rFonts w:ascii="Arial" w:hAnsi="Arial" w:cs="Arial"/>
+                <w:lang w:val="en-US"/>
+              </w:rPr>
+            </w:pPr>
+            <w:sdt>
+              <w:sdtPr>
+                <w:rPr>
+                  <w:rFonts w:ascii="Arial" w:hAnsi="Arial" w:cs="Arial"/>
+                  <w:lang w:val="en-US"/>
+                </w:rPr>
+                <w:id w:val="286634127"/>
+                <w14:checkbox>
+                  <w14:checked w14:val="0"/>
+                  <w14:checkedState w14:val="2612" w14:font="MS Gothic"/>
+                  <w14:uncheckedState w14:val="2610" w14:font="MS Gothic"/>
+                </w14:checkbox>
+              </w:sdtPr>
+              <w:sdtEndPr/>
+              <w:sdtContent>
+                <w:r>
+                  <w:rPr>
+                    <w:rFonts w:ascii="Segoe UI Symbol" w:eastAsia="MS Gothic" w:hAnsi="Segoe UI Symbol" w:cs="Segoe UI Symbol"/>
+                    <w:lang w:val="en-US"/>
+                  </w:rPr>
+                  <w:t>☐</w:t>
+                </w:r>
+              </w:sdtContent>
+            </w:sdt>
+            <w:r>
+              <w:rPr>
+                <w:rFonts w:ascii="Arial" w:hAnsi="Arial" w:cs="Arial"/>
+                <w:lang w:val="en-US"/>
+              </w:rPr>
+              <w:t xml:space="preserve"> 1 </w:t>
+            </w:r>
+            <w:proofErr w:type="spellStart"/>
+            <w:r>
+              <w:rPr>
+                <w:rFonts w:ascii="Arial" w:hAnsi="Arial" w:cs="Arial"/>
+                <w:lang w:val="en-US"/>
+              </w:rPr>
+              <w:t>Vrms</w:t>
+            </w:r>
+            <w:proofErr w:type="spellEnd"/>
+            <w:r>
+              <w:rPr>
+                <w:rFonts w:ascii="Arial" w:hAnsi="Arial" w:cs="Arial"/>
+                <w:lang w:val="en-US"/>
+              </w:rPr>
+              <w:t xml:space="preserve"> </w:t>
+            </w:r>
+            <w:sdt>
+              <w:sdtPr>
+                <w:rPr>
+                  <w:rFonts w:ascii="Arial" w:hAnsi="Arial" w:cs="Arial"/>
+                  <w:lang w:val="en-US"/>
+                </w:rPr>
+                <w:id w:val="-1093698183"/>
+                <w14:checkbox>
+                  <w14:checked w14:val="0"/>
+                  <w14:checkedState w14:val="2612" w14:font="MS Gothic"/>
+                  <w14:uncheckedState w14:val="2610" w14:font="MS Gothic"/>
+                </w14:checkbox>
+              </w:sdtPr>
+              <w:sdtEndPr/>
+              <w:sdtContent>
+                <w:r>
+                  <w:rPr>
+                    <w:rFonts w:ascii="Segoe UI Symbol" w:eastAsia="MS Gothic" w:hAnsi="Segoe UI Symbol" w:cs="Segoe UI Symbol"/>
+                    <w:lang w:val="en-US"/>
+                  </w:rPr>
+                  <w:t>☐</w:t>
+                </w:r>
+              </w:sdtContent>
+            </w:sdt>
+            <w:r>
+              <w:rPr>
+                <w:rFonts w:ascii="Arial" w:hAnsi="Arial" w:cs="Arial"/>
+                <w:lang w:val="en-US"/>
+              </w:rPr>
+              <w:t xml:space="preserve"> 3 </w:t>
+            </w:r>
+            <w:proofErr w:type="spellStart"/>
+            <w:r>
+              <w:rPr>
+                <w:rFonts w:ascii="Arial" w:hAnsi="Arial" w:cs="Arial"/>
+                <w:lang w:val="en-US"/>
+              </w:rPr>
+              <w:t>Vrms</w:t>
+            </w:r>
+            <w:proofErr w:type="spellEnd"/>
+          </w:p>
+          <w:p>
+            <w:pPr>
+              <w:spacing w:line="276" w:lineRule="auto"/>
+              <w:rPr>
+                <w:rFonts w:ascii="Arial" w:hAnsi="Arial" w:cs="Arial"/>
+                <w:lang w:val="en-US"/>
+              </w:rPr>
+            </w:pPr>
+            <w:sdt>
+              <w:sdtPr>
+                <w:rPr>
+                  <w:rFonts w:ascii="Arial" w:hAnsi="Arial" w:cs="Arial"/>
+                  <w:lang w:val="en-US"/>
+                </w:rPr>
+                <w:id w:val="-1145736544"/>
+                <w14:checkbox>
+                  <w14:checked w14:val="0"/>
+                  <w14:checkedState w14:val="2612" w14:font="MS Gothic"/>
+                  <w14:uncheckedState w14:val="2610" w14:font="MS Gothic"/>
+                </w14:checkbox>
+              </w:sdtPr>
+              <w:sdtEndPr/>
+              <w:sdtContent>
+                <w:r>
+                  <w:rPr>
+                    <w:rFonts w:ascii="Segoe UI Symbol" w:eastAsia="MS Gothic" w:hAnsi="Segoe UI Symbol" w:cs="Segoe UI Symbol"/>
+                    <w:lang w:val="en-US"/>
+                  </w:rPr>
+                  <w:t>☐</w:t>
+                </w:r>
+              </w:sdtContent>
+            </w:sdt>
+            <w:r>
+              <w:rPr>
+                <w:rFonts w:ascii="Arial" w:hAnsi="Arial" w:cs="Arial"/>
+                <w:lang w:val="en-US"/>
+              </w:rPr>
+              <w:t xml:space="preserve"> 10 </w:t>
+            </w:r>
+            <w:proofErr w:type="spellStart"/>
+            <w:r>
+              <w:rPr>
+                <w:rFonts w:ascii="Arial" w:hAnsi="Arial" w:cs="Arial"/>
+                <w:lang w:val="en-US"/>
+              </w:rPr>
+              <w:t>Vrms</w:t>
+            </w:r>
+            <w:proofErr w:type="spellEnd"/>
+            <w:r>
+              <w:rPr>
+                <w:rFonts w:ascii="Arial" w:hAnsi="Arial" w:cs="Arial"/>
+                <w:lang w:val="en-US"/>
+              </w:rPr>
+              <w:t xml:space="preserve">  </w:t>
+            </w:r>
+            <w:sdt>
+              <w:sdtPr>
+                <w:rPr>
+                  <w:rFonts w:ascii="Arial" w:hAnsi="Arial" w:cs="Arial"/>
+                  <w:lang w:val="en-US"/>
+                </w:rPr>
+                <w:id w:val="1818217606"/>
+                <w14:checkbox>
+                  <w14:checked w14:val="0"/>
+                  <w14:checkedState w14:val="2612" w14:font="MS Gothic"/>
+                  <w14:uncheckedState w14:val="2610" w14:font="MS Gothic"/>
+                </w14:checkbox>
+              </w:sdtPr>
+              <w:sdtEndPr/>
+              <w:sdtContent>
+                <w:r>
+                  <w:rPr>
+                    <w:rFonts w:ascii="Segoe UI Symbol" w:eastAsia="MS Gothic" w:hAnsi="Segoe UI Symbol" w:cs="Segoe UI Symbol"/>
+                    <w:lang w:val="en-US"/>
+                  </w:rPr>
+                  <w:t>☐</w:t>
+                </w:r>
+              </w:sdtContent>
+            </w:sdt>
+            <w:r>
+              <w:rPr>
+                <w:rFonts w:ascii="Arial" w:hAnsi="Arial" w:cs="Arial"/>
+                <w:lang w:val="en-US"/>
+              </w:rPr>
+              <w:t xml:space="preserve"> Custom___</w:t>
             </w:r>
           </w:p>
         </w:tc>
@@ -1447,8 +1629,187 @@
             <w:vAlign w:val="center"/>
           </w:tcPr>
           <w:p>
-            <w:r/>
-            <w:r/>
+            <w:pPr>
+              <w:spacing w:line="276" w:lineRule="auto"/>
+              <w:rPr>
+                <w:rFonts w:ascii="Arial" w:hAnsi="Arial" w:cs="Arial"/>
+                <w:lang w:val="en-US"/>
+              </w:rPr>
+            </w:pPr>
+            <w:sdt>
+              <w:sdtPr>
+                <w:rPr>
+                  <w:rFonts w:ascii="Arial" w:hAnsi="Arial" w:cs="Arial"/>
+                  <w:lang w:val="en-US"/>
+                </w:rPr>
+                <w:id w:val="2066834428"/>
+                <w14:checkbox>
+                  <w14:checked w14:val="0"/>
+                  <w14:checkedState w14:val="2612" w14:font="MS Gothic"/>
+                  <w14:uncheckedState w14:val="2610" w14:font="MS Gothic"/>
+                </w14:checkbox>
+              </w:sdtPr>
+              <w:sdtEndPr/>
+              <w:sdtContent>
+                <w:r>
+                  <w:rPr>
+                    <w:rFonts w:ascii="Segoe UI Symbol" w:eastAsia="MS Gothic" w:hAnsi="Segoe UI Symbol" w:cs="Segoe UI Symbol"/>
+                    <w:lang w:val="en-US"/>
+                  </w:rPr>
+                  <w:t>☐</w:t>
+                </w:r>
+              </w:sdtContent>
+            </w:sdt>
+            <w:r>
+              <w:rPr>
+                <w:rFonts w:ascii="Arial" w:hAnsi="Arial" w:cs="Arial"/>
+                <w:lang w:val="en-US"/>
+              </w:rPr>
+              <w:t xml:space="preserve"> 1 </w:t>
+            </w:r>
+            <w:proofErr w:type="spellStart"/>
+            <w:r>
+              <w:rPr>
+                <w:rFonts w:ascii="Arial" w:hAnsi="Arial" w:cs="Arial"/>
+                <w:lang w:val="en-US"/>
+              </w:rPr>
+              <w:t>Vrms</w:t>
+            </w:r>
+            <w:proofErr w:type="spellEnd"/>
+            <w:r>
+              <w:rPr>
+                <w:rFonts w:ascii="Arial" w:hAnsi="Arial" w:cs="Arial"/>
+                <w:lang w:val="en-US"/>
+              </w:rPr>
+              <w:t xml:space="preserve"> </w:t>
+            </w:r>
+            <w:sdt>
+              <w:sdtPr>
+                <w:rPr>
+                  <w:rFonts w:ascii="Arial" w:hAnsi="Arial" w:cs="Arial"/>
+                  <w:lang w:val="en-US"/>
+                </w:rPr>
+                <w:id w:val="353315302"/>
+                <w14:checkbox>
+                  <w14:checked w14:val="0"/>
+                  <w14:checkedState w14:val="2612" w14:font="MS Gothic"/>
+                  <w14:uncheckedState w14:val="2610" w14:font="MS Gothic"/>
+                </w14:checkbox>
+              </w:sdtPr>
+              <w:sdtEndPr/>
+              <w:sdtContent>
+                <w:r>
+                  <w:rPr>
+                    <w:rFonts w:ascii="Segoe UI Symbol" w:eastAsia="MS Gothic" w:hAnsi="Segoe UI Symbol" w:cs="Segoe UI Symbol"/>
+                    <w:lang w:val="en-US"/>
+                  </w:rPr>
+                  <w:t>☐</w:t>
+                </w:r>
+              </w:sdtContent>
+            </w:sdt>
+            <w:r>
+              <w:rPr>
+                <w:rFonts w:ascii="Arial" w:hAnsi="Arial" w:cs="Arial"/>
+                <w:lang w:val="en-US"/>
+              </w:rPr>
+              <w:t xml:space="preserve"> 3 </w:t>
+            </w:r>
+            <w:proofErr w:type="spellStart"/>
+            <w:r>
+              <w:rPr>
+                <w:rFonts w:ascii="Arial" w:hAnsi="Arial" w:cs="Arial"/>
+                <w:lang w:val="en-US"/>
+              </w:rPr>
+              <w:t>Vrms</w:t>
+            </w:r>
+            <w:proofErr w:type="spellEnd"/>
+          </w:p>
+          <w:p>
+            <w:pPr>
+              <w:spacing w:line="276" w:lineRule="auto"/>
+              <w:rPr>
+                <w:rFonts w:ascii="Arial" w:hAnsi="Arial" w:cs="Arial"/>
+                <w:lang w:val="en-US"/>
+              </w:rPr>
+            </w:pPr>
+            <w:sdt>
+              <w:sdtPr>
+                <w:rPr>
+                  <w:rFonts w:ascii="Arial" w:hAnsi="Arial" w:cs="Arial"/>
+                  <w:lang w:val="en-US"/>
+                </w:rPr>
+                <w:id w:val="-1124765337"/>
+                <w14:checkbox>
+                  <w14:checked w14:val="0"/>
+                  <w14:checkedState w14:val="2612" w14:font="MS Gothic"/>
+                  <w14:uncheckedState w14:val="2610" w14:font="MS Gothic"/>
+                </w14:checkbox>
+              </w:sdtPr>
+              <w:sdtEndPr/>
+              <w:sdtContent>
+                <w:r>
+                  <w:rPr>
+                    <w:rFonts w:ascii="Segoe UI Symbol" w:eastAsia="MS Gothic" w:hAnsi="Segoe UI Symbol" w:cs="Segoe UI Symbol"/>
+                    <w:lang w:val="en-US"/>
+                  </w:rPr>
+                  <w:t>☐</w:t>
+                </w:r>
+              </w:sdtContent>
+            </w:sdt>
+            <w:r>
+              <w:rPr>
+                <w:rFonts w:ascii="Arial" w:hAnsi="Arial" w:cs="Arial"/>
+                <w:lang w:val="en-US"/>
+              </w:rPr>
+              <w:t xml:space="preserve"> 10 </w:t>
+            </w:r>
+            <w:proofErr w:type="spellStart"/>
+            <w:r>
+              <w:rPr>
+                <w:rFonts w:ascii="Arial" w:hAnsi="Arial" w:cs="Arial"/>
+                <w:lang w:val="en-US"/>
+              </w:rPr>
+              <w:t>Vrms</w:t>
+            </w:r>
+            <w:proofErr w:type="spellEnd"/>
+            <w:r>
+              <w:rPr>
+                <w:rFonts w:ascii="Arial" w:hAnsi="Arial" w:cs="Arial"/>
+                <w:lang w:val="en-US"/>
+              </w:rPr>
+              <w:t xml:space="preserve">  </w:t>
+            </w:r>
+            <w:sdt>
+              <w:sdtPr>
+                <w:rPr>
+                  <w:rFonts w:ascii="Arial" w:hAnsi="Arial" w:cs="Arial"/>
+                  <w:lang w:val="en-US"/>
+                </w:rPr>
+                <w:id w:val="-566571278"/>
+                <w14:checkbox>
+                  <w14:checked w14:val="0"/>
+                  <w14:checkedState w14:val="2612" w14:font="MS Gothic"/>
+                  <w14:uncheckedState w14:val="2610" w14:font="MS Gothic"/>
+                </w14:checkbox>
+              </w:sdtPr>
+              <w:sdtEndPr/>
+              <w:sdtContent>
+                <w:r>
+                  <w:rPr>
+                    <w:rFonts w:ascii="Segoe UI Symbol" w:eastAsia="MS Gothic" w:hAnsi="Segoe UI Symbol" w:cs="Segoe UI Symbol"/>
+                    <w:lang w:val="en-US"/>
+                  </w:rPr>
+                  <w:t>☐</w:t>
+                </w:r>
+              </w:sdtContent>
+            </w:sdt>
+            <w:r>
+              <w:rPr>
+                <w:rFonts w:ascii="Arial" w:hAnsi="Arial" w:cs="Arial"/>
+                <w:lang w:val="en-US"/>
+              </w:rPr>
+              <w:t xml:space="preserve"> Custom___</w:t>
+            </w:r>
           </w:p>
         </w:tc>
       </w:tr>
@@ -1867,7 +2228,7 @@
           <w:p>
             <w:r/>
             <w:r>
-              <w:t>{{ eut_configuration }}</w:t>
+              <w:t>{{ eut_configuration_1_vrms_3_vrms_10_vrms_custom }}</w:t>
             </w:r>
           </w:p>
         </w:tc>
@@ -1878,7 +2239,9 @@
           </w:tcPr>
           <w:p>
             <w:r/>
-            <w:r/>
+            <w:r>
+              <w:t>{{ eut_configuration_1_vrms_3_vrms_10_vrms_custom_2 }}</w:t>
+            </w:r>
           </w:p>
         </w:tc>
       </w:tr>
@@ -2392,9 +2755,30 @@
             <w:hideMark/>
           </w:tcPr>
           <w:p>
-            <w:r/>
-            <w:r>
-              <w:t>{{ frequency_range_2 }}</w:t>
+            <w:pPr>
+              <w:spacing w:after="0" w:line="240" w:lineRule="auto"/>
+              <w:jc w:val="center"/>
+              <w:rPr>
+                <w:rFonts w:ascii="Arial" w:eastAsia="Times New Roman" w:hAnsi="Arial" w:cs="Arial"/>
+                <w:b/>
+                <w:bCs/>
+                <w:color w:val="000000"/>
+                <w:kern w:val="0"/>
+                <w:lang w:eastAsia="en-IN"/>
+                <w14:ligatures w14:val="none"/>
+              </w:rPr>
+            </w:pPr>
+            <w:r>
+              <w:rPr>
+                <w:rFonts w:ascii="Arial" w:eastAsia="Times New Roman" w:hAnsi="Arial" w:cs="Arial"/>
+                <w:b/>
+                <w:bCs/>
+                <w:color w:val="000000"/>
+                <w:kern w:val="0"/>
+                <w:lang w:eastAsia="en-IN"/>
+                <w14:ligatures w14:val="none"/>
+              </w:rPr>
+              <w:t>Port Name</w:t>
             </w:r>
           </w:p>
         </w:tc>
@@ -2413,7 +2797,9 @@
           </w:tcPr>
           <w:p>
             <w:r/>
-            <w:r/>
+            <w:r>
+              <w:t>{{ frequency_range_port_name_col_2 }}</w:t>
+            </w:r>
           </w:p>
         </w:tc>
         <w:tc>
@@ -2431,7 +2817,9 @@
           </w:tcPr>
           <w:p>
             <w:r/>
-            <w:r/>
+            <w:r>
+              <w:t>{{ frequency_range_port_name_col_3 }}</w:t>
+            </w:r>
           </w:p>
         </w:tc>
         <w:tc>
@@ -2449,7 +2837,9 @@
           </w:tcPr>
           <w:p>
             <w:r/>
-            <w:r/>
+            <w:r>
+              <w:t>{{ frequency_range_port_name_col_4 }}</w:t>
+            </w:r>
           </w:p>
         </w:tc>
       </w:tr>
@@ -2510,7 +2900,7 @@
           <w:p>
             <w:r/>
             <w:r>
-              <w:t>{{ f_0_15_to_80 }}</w:t>
+              <w:t>{{ f_0_15_to_80_col_1 }}</w:t>
             </w:r>
           </w:p>
         </w:tc>
@@ -2529,7 +2919,9 @@
           </w:tcPr>
           <w:p>
             <w:r/>
-            <w:r/>
+            <w:r>
+              <w:t>{{ f_0_15_to_80_col_2 }}</w:t>
+            </w:r>
           </w:p>
         </w:tc>
         <w:tc>
@@ -2547,7 +2939,9 @@
           </w:tcPr>
           <w:p>
             <w:r/>
-            <w:r/>
+            <w:r>
+              <w:t>{{ f_0_15_to_80_col_3 }}</w:t>
+            </w:r>
           </w:p>
         </w:tc>
         <w:tc>
@@ -2565,7 +2959,9 @@
           </w:tcPr>
           <w:p>
             <w:r/>
-            <w:r/>
+            <w:r>
+              <w:t>{{ f_0_15_to_80_col_4 }}</w:t>
+            </w:r>
           </w:p>
         </w:tc>
       </w:tr>
@@ -2637,7 +3033,7 @@
           <w:p>
             <w:r/>
             <w:r>
-              <w:t>{{ ism_band }}</w:t>
+              <w:t>{{ ism_band_col_1 }}</w:t>
             </w:r>
           </w:p>
         </w:tc>
@@ -2656,7 +3052,9 @@
           </w:tcPr>
           <w:p>
             <w:r/>
-            <w:r/>
+            <w:r>
+              <w:t>{{ ism_band_col_2 }}</w:t>
+            </w:r>
           </w:p>
         </w:tc>
         <w:tc>
@@ -2674,7 +3072,9 @@
           </w:tcPr>
           <w:p>
             <w:r/>
-            <w:r/>
+            <w:r>
+              <w:t>{{ ism_band_col_3 }}</w:t>
+            </w:r>
           </w:p>
         </w:tc>
         <w:tc>
@@ -2692,7 +3092,9 @@
           </w:tcPr>
           <w:p>
             <w:r/>
-            <w:r/>
+            <w:r>
+              <w:t>{{ ism_band_col_4 }}</w:t>
+            </w:r>
           </w:p>
         </w:tc>
       </w:tr>
@@ -2807,6 +3209,7 @@
       <w:tr>
         <w:trPr>
           <w:trHeight w:val="290"/>
+          <w:tblHeader/>
         </w:trPr>
         <w:tc>
           <w:tcPr>
@@ -3377,8 +3780,16 @@
     </w:p>
     <w:p>
       <w:pPr>
+        <w:spacing w:before="0" w:after="0"/>
+      </w:pPr>
+      <w:r>
+        <w:t>{{ img_photo_1 }}</w:t>
+      </w:r>
+    </w:p>
+    <w:p>
+      <w:pPr>
         <w:pStyle w:val="Caption"/>
-        <w:spacing w:after="0"/>
+        <w:spacing w:after="0" w:before="0"/>
         <w:jc w:val="center"/>
         <w:rPr>
           <w:rFonts w:ascii="Arial" w:hAnsi="Arial" w:cs="Arial"/>
@@ -3574,11 +3985,6 @@
       <w:bookmarkEnd w:id="135"/>
     </w:p>
     <w:p>
-      <w:r>
-        <w:t>{{ img_photo_1 }}</w:t>
-      </w:r>
-    </w:p>
-    <w:p>
       <w:pPr>
         <w:spacing w:after="0"/>
         <w:jc w:val="center"/>
@@ -3592,8 +3998,16 @@
     </w:p>
     <w:p>
       <w:pPr>
+        <w:spacing w:before="0" w:after="0"/>
+      </w:pPr>
+      <w:r>
+        <w:t>{{ img_photo_2 }}</w:t>
+      </w:r>
+    </w:p>
+    <w:p>
+      <w:pPr>
         <w:pStyle w:val="Caption"/>
-        <w:spacing w:after="0"/>
+        <w:spacing w:after="0" w:before="0"/>
         <w:jc w:val="center"/>
         <w:rPr>
           <w:rFonts w:ascii="Arial" w:hAnsi="Arial" w:cs="Arial"/>
@@ -3773,11 +4187,6 @@
         <w:t xml:space="preserve"> Signal Line</w:t>
       </w:r>
       <w:bookmarkEnd w:id="136"/>
-    </w:p>
-    <w:p>
-      <w:r>
-        <w:t>{{ img_photo_2 }}</w:t>
-      </w:r>
     </w:p>
     <w:p>
       <w:pPr>
@@ -3848,6 +4257,7 @@
       <w:tr>
         <w:trPr>
           <w:trHeight w:val="567"/>
+          <w:tblHeader/>
         </w:trPr>
         <w:tc>
           <w:tcPr>
@@ -4197,6 +4607,7 @@
       <w:tr>
         <w:trPr>
           <w:trHeight w:val="340"/>
+          <w:tblHeader/>
         </w:trPr>
         <w:tc>
           <w:tcPr>
@@ -4486,9 +4897,23 @@
             <w:vAlign w:val="center"/>
           </w:tcPr>
           <w:p>
-            <w:r/>
-            <w:r>
-              <w:t>{{ tested_by_2 }}</w:t>
+            <w:pPr>
+              <w:jc w:val="center"/>
+              <w:rPr>
+                <w:rFonts w:ascii="Arial" w:hAnsi="Arial" w:cs="Arial"/>
+                <w:b/>
+                <w:bCs/>
+                <w:color w:val="000000" w:themeColor="text1"/>
+              </w:rPr>
+            </w:pPr>
+            <w:r>
+              <w:rPr>
+                <w:rFonts w:ascii="Arial" w:eastAsiaTheme="majorEastAsia" w:hAnsi="Arial" w:cs="Arial"/>
+                <w:b/>
+                <w:bCs/>
+                <w:lang w:val="en-US"/>
+              </w:rPr>
+              <w:t>Tested By</w:t>
             </w:r>
           </w:p>
         </w:tc>

</xml_diff>

<commit_message>
Client workflow layer (report-automation working tree) over NLP baseline
</commit_message>
<xml_diff>
--- a/datasheet_gen/word_templates/CRF.docx
+++ b/datasheet_gen/word_templates/CRF.docx
@@ -1219,7 +1219,6 @@
             <w:vAlign w:val="center"/>
           </w:tcPr>
           <w:p>
-            <w:r/>
             <w:r>
               <w:t>{{ product_standard }}</w:t>
             </w:r>
@@ -1259,7 +1258,6 @@
             <w:vAlign w:val="center"/>
           </w:tcPr>
           <w:p>
-            <w:r/>
             <w:r>
               <w:t>{{ basic_standard }}</w:t>
             </w:r>
@@ -1299,7 +1297,6 @@
             <w:vAlign w:val="center"/>
           </w:tcPr>
           <w:p>
-            <w:r/>
             <w:r>
               <w:t>{{ immunity_test_requirement }}</w:t>
             </w:r>
@@ -1334,25 +1331,13 @@
         </w:tc>
         <w:tc>
           <w:tcPr>
-            <w:tcW w:w="2886" w:type="dxa"/>
+            <w:tcW w:w="5773" w:type="dxa"/>
+            <w:gridSpan w:val="2"/>
             <w:vAlign w:val="center"/>
           </w:tcPr>
           <w:p>
-            <w:r/>
-            <w:r>
-              <w:t>{{ test_port_col_1 }}</w:t>
-            </w:r>
-          </w:p>
-        </w:tc>
-        <w:tc>
-          <w:tcPr>
-            <w:tcW w:w="2887" w:type="dxa"/>
-            <w:vAlign w:val="center"/>
-          </w:tcPr>
-          <w:p>
-            <w:r/>
-            <w:r>
-              <w:t>{{ test_port_col_2 }}</w:t>
+            <w:r>
+              <w:t>{{ test_port }}</w:t>
             </w:r>
           </w:p>
         </w:tc>
@@ -1385,25 +1370,13 @@
         </w:tc>
         <w:tc>
           <w:tcPr>
-            <w:tcW w:w="2886" w:type="dxa"/>
+            <w:tcW w:w="5773" w:type="dxa"/>
+            <w:gridSpan w:val="2"/>
             <w:vAlign w:val="center"/>
           </w:tcPr>
           <w:p>
-            <w:r/>
-            <w:r>
-              <w:t>{{ coupling_method_col_1 }}</w:t>
-            </w:r>
-          </w:p>
-        </w:tc>
-        <w:tc>
-          <w:tcPr>
-            <w:tcW w:w="2887" w:type="dxa"/>
-            <w:vAlign w:val="center"/>
-          </w:tcPr>
-          <w:p>
-            <w:r/>
-            <w:r>
-              <w:t>{{ coupling_method_col_2 }}</w:t>
+            <w:r>
+              <w:t>{{ coupling_method }}</w:t>
             </w:r>
           </w:p>
         </w:tc>
@@ -1436,7 +1409,24 @@
         </w:tc>
         <w:tc>
           <w:tcPr>
-            <w:tcW w:w="2886" w:type="dxa"/>
+            <w:tcW w:w="5773" w:type="dxa"/>
+            <w:gridSpan w:val="2"/>
+            <w:vAlign w:val="center"/>
+          </w:tcPr>
+          <w:p>
+            <w:r>
+              <w:t>{{ test_level }}</w:t>
+            </w:r>
+          </w:p>
+        </w:tc>
+      </w:tr>
+      <w:tr>
+        <w:trPr>
+          <w:trHeight w:val="340"/>
+        </w:trPr>
+        <w:tc>
+          <w:tcPr>
+            <w:tcW w:w="3243" w:type="dxa"/>
             <w:vAlign w:val="center"/>
           </w:tcPr>
           <w:p>
@@ -1447,94 +1437,37 @@
                 <w:lang w:val="en-US"/>
               </w:rPr>
             </w:pPr>
-            <w:sdt>
-              <w:sdtPr>
-                <w:rPr>
-                  <w:rFonts w:ascii="Arial" w:hAnsi="Arial" w:cs="Arial"/>
-                  <w:lang w:val="en-US"/>
-                </w:rPr>
-                <w:id w:val="286634127"/>
-                <w14:checkbox>
-                  <w14:checked w14:val="0"/>
-                  <w14:checkedState w14:val="2612" w14:font="MS Gothic"/>
-                  <w14:uncheckedState w14:val="2610" w14:font="MS Gothic"/>
-                </w14:checkbox>
-              </w:sdtPr>
-              <w:sdtEndPr/>
-              <w:sdtContent>
-                <w:r>
-                  <w:rPr>
-                    <w:rFonts w:ascii="Segoe UI Symbol" w:eastAsia="MS Gothic" w:hAnsi="Segoe UI Symbol" w:cs="Segoe UI Symbol"/>
-                    <w:lang w:val="en-US"/>
-                  </w:rPr>
-                  <w:t>☐</w:t>
-                </w:r>
-              </w:sdtContent>
-            </w:sdt>
             <w:r>
               <w:rPr>
                 <w:rFonts w:ascii="Arial" w:hAnsi="Arial" w:cs="Arial"/>
                 <w:lang w:val="en-US"/>
               </w:rPr>
-              <w:t xml:space="preserve"> 1 </w:t>
-            </w:r>
-            <w:proofErr w:type="spellStart"/>
-            <w:r>
-              <w:rPr>
-                <w:rFonts w:ascii="Arial" w:hAnsi="Arial" w:cs="Arial"/>
-                <w:lang w:val="en-US"/>
-              </w:rPr>
-              <w:t>Vrms</w:t>
-            </w:r>
-            <w:proofErr w:type="spellEnd"/>
-            <w:r>
-              <w:rPr>
-                <w:rFonts w:ascii="Arial" w:hAnsi="Arial" w:cs="Arial"/>
-                <w:lang w:val="en-US"/>
-              </w:rPr>
-              <w:t xml:space="preserve"> </w:t>
-            </w:r>
-            <w:sdt>
-              <w:sdtPr>
-                <w:rPr>
-                  <w:rFonts w:ascii="Arial" w:hAnsi="Arial" w:cs="Arial"/>
-                  <w:lang w:val="en-US"/>
-                </w:rPr>
-                <w:id w:val="-1093698183"/>
-                <w14:checkbox>
-                  <w14:checked w14:val="0"/>
-                  <w14:checkedState w14:val="2612" w14:font="MS Gothic"/>
-                  <w14:uncheckedState w14:val="2610" w14:font="MS Gothic"/>
-                </w14:checkbox>
-              </w:sdtPr>
-              <w:sdtEndPr/>
-              <w:sdtContent>
-                <w:r>
-                  <w:rPr>
-                    <w:rFonts w:ascii="Segoe UI Symbol" w:eastAsia="MS Gothic" w:hAnsi="Segoe UI Symbol" w:cs="Segoe UI Symbol"/>
-                    <w:lang w:val="en-US"/>
-                  </w:rPr>
-                  <w:t>☐</w:t>
-                </w:r>
-              </w:sdtContent>
-            </w:sdt>
-            <w:r>
-              <w:rPr>
-                <w:rFonts w:ascii="Arial" w:hAnsi="Arial" w:cs="Arial"/>
-                <w:lang w:val="en-US"/>
-              </w:rPr>
-              <w:t xml:space="preserve"> 3 </w:t>
-            </w:r>
-            <w:proofErr w:type="spellStart"/>
-            <w:r>
-              <w:rPr>
-                <w:rFonts w:ascii="Arial" w:hAnsi="Arial" w:cs="Arial"/>
-                <w:lang w:val="en-US"/>
-              </w:rPr>
-              <w:t>Vrms</w:t>
-            </w:r>
-            <w:proofErr w:type="spellEnd"/>
+              <w:t>Frequency Range</w:t>
+            </w:r>
           </w:p>
+        </w:tc>
+        <w:tc>
+          <w:tcPr>
+            <w:tcW w:w="5773" w:type="dxa"/>
+            <w:gridSpan w:val="2"/>
+            <w:vAlign w:val="center"/>
+          </w:tcPr>
+          <w:p>
+            <w:r>
+              <w:t>{{ frequency_range }}</w:t>
+            </w:r>
+          </w:p>
+        </w:tc>
+      </w:tr>
+      <w:tr>
+        <w:trPr>
+          <w:trHeight w:val="340"/>
+        </w:trPr>
+        <w:tc>
+          <w:tcPr>
+            <w:tcW w:w="3243" w:type="dxa"/>
+            <w:vAlign w:val="center"/>
+          </w:tcPr>
           <w:p>
             <w:pPr>
               <w:spacing w:line="276" w:lineRule="auto"/>
@@ -1543,89 +1476,35 @@
                 <w:lang w:val="en-US"/>
               </w:rPr>
             </w:pPr>
-            <w:sdt>
-              <w:sdtPr>
-                <w:rPr>
-                  <w:rFonts w:ascii="Arial" w:hAnsi="Arial" w:cs="Arial"/>
-                  <w:lang w:val="en-US"/>
-                </w:rPr>
-                <w:id w:val="-1145736544"/>
-                <w14:checkbox>
-                  <w14:checked w14:val="0"/>
-                  <w14:checkedState w14:val="2612" w14:font="MS Gothic"/>
-                  <w14:uncheckedState w14:val="2610" w14:font="MS Gothic"/>
-                </w14:checkbox>
-              </w:sdtPr>
-              <w:sdtEndPr/>
-              <w:sdtContent>
-                <w:r>
-                  <w:rPr>
-                    <w:rFonts w:ascii="Segoe UI Symbol" w:eastAsia="MS Gothic" w:hAnsi="Segoe UI Symbol" w:cs="Segoe UI Symbol"/>
-                    <w:lang w:val="en-US"/>
-                  </w:rPr>
-                  <w:t>☐</w:t>
-                </w:r>
-              </w:sdtContent>
-            </w:sdt>
             <w:r>
               <w:rPr>
                 <w:rFonts w:ascii="Arial" w:hAnsi="Arial" w:cs="Arial"/>
                 <w:lang w:val="en-US"/>
               </w:rPr>
-              <w:t xml:space="preserve"> 10 </w:t>
-            </w:r>
-            <w:proofErr w:type="spellStart"/>
-            <w:r>
-              <w:rPr>
-                <w:rFonts w:ascii="Arial" w:hAnsi="Arial" w:cs="Arial"/>
-                <w:lang w:val="en-US"/>
-              </w:rPr>
-              <w:t>Vrms</w:t>
-            </w:r>
-            <w:proofErr w:type="spellEnd"/>
-            <w:r>
-              <w:rPr>
-                <w:rFonts w:ascii="Arial" w:hAnsi="Arial" w:cs="Arial"/>
-                <w:lang w:val="en-US"/>
-              </w:rPr>
-              <w:t xml:space="preserve">  </w:t>
-            </w:r>
-            <w:sdt>
-              <w:sdtPr>
-                <w:rPr>
-                  <w:rFonts w:ascii="Arial" w:hAnsi="Arial" w:cs="Arial"/>
-                  <w:lang w:val="en-US"/>
-                </w:rPr>
-                <w:id w:val="1818217606"/>
-                <w14:checkbox>
-                  <w14:checked w14:val="0"/>
-                  <w14:checkedState w14:val="2612" w14:font="MS Gothic"/>
-                  <w14:uncheckedState w14:val="2610" w14:font="MS Gothic"/>
-                </w14:checkbox>
-              </w:sdtPr>
-              <w:sdtEndPr/>
-              <w:sdtContent>
-                <w:r>
-                  <w:rPr>
-                    <w:rFonts w:ascii="Segoe UI Symbol" w:eastAsia="MS Gothic" w:hAnsi="Segoe UI Symbol" w:cs="Segoe UI Symbol"/>
-                    <w:lang w:val="en-US"/>
-                  </w:rPr>
-                  <w:t>☐</w:t>
-                </w:r>
-              </w:sdtContent>
-            </w:sdt>
-            <w:r>
-              <w:rPr>
-                <w:rFonts w:ascii="Arial" w:hAnsi="Arial" w:cs="Arial"/>
-                <w:lang w:val="en-US"/>
-              </w:rPr>
-              <w:t xml:space="preserve"> Custom___</w:t>
+              <w:t>Frequency Step size</w:t>
             </w:r>
           </w:p>
         </w:tc>
         <w:tc>
           <w:tcPr>
-            <w:tcW w:w="2887" w:type="dxa"/>
+            <w:tcW w:w="5773" w:type="dxa"/>
+            <w:gridSpan w:val="2"/>
+            <w:vAlign w:val="center"/>
+          </w:tcPr>
+          <w:p>
+            <w:r>
+              <w:t>{{ frequency_step_size }}</w:t>
+            </w:r>
+          </w:p>
+        </w:tc>
+      </w:tr>
+      <w:tr>
+        <w:trPr>
+          <w:trHeight w:val="340"/>
+        </w:trPr>
+        <w:tc>
+          <w:tcPr>
+            <w:tcW w:w="3243" w:type="dxa"/>
             <w:vAlign w:val="center"/>
           </w:tcPr>
           <w:p>
@@ -1636,94 +1515,75 @@
                 <w:lang w:val="en-US"/>
               </w:rPr>
             </w:pPr>
-            <w:sdt>
-              <w:sdtPr>
-                <w:rPr>
-                  <w:rFonts w:ascii="Arial" w:hAnsi="Arial" w:cs="Arial"/>
-                  <w:lang w:val="en-US"/>
-                </w:rPr>
-                <w:id w:val="2066834428"/>
-                <w14:checkbox>
-                  <w14:checked w14:val="0"/>
-                  <w14:checkedState w14:val="2612" w14:font="MS Gothic"/>
-                  <w14:uncheckedState w14:val="2610" w14:font="MS Gothic"/>
-                </w14:checkbox>
-              </w:sdtPr>
-              <w:sdtEndPr/>
-              <w:sdtContent>
-                <w:r>
-                  <w:rPr>
-                    <w:rFonts w:ascii="Segoe UI Symbol" w:eastAsia="MS Gothic" w:hAnsi="Segoe UI Symbol" w:cs="Segoe UI Symbol"/>
-                    <w:lang w:val="en-US"/>
-                  </w:rPr>
-                  <w:t>☐</w:t>
-                </w:r>
-              </w:sdtContent>
-            </w:sdt>
             <w:r>
               <w:rPr>
                 <w:rFonts w:ascii="Arial" w:hAnsi="Arial" w:cs="Arial"/>
                 <w:lang w:val="en-US"/>
               </w:rPr>
-              <w:t xml:space="preserve"> 1 </w:t>
-            </w:r>
-            <w:proofErr w:type="spellStart"/>
-            <w:r>
+              <w:t>Dwell Time</w:t>
+            </w:r>
+          </w:p>
+        </w:tc>
+        <w:tc>
+          <w:tcPr>
+            <w:tcW w:w="5773" w:type="dxa"/>
+            <w:gridSpan w:val="2"/>
+            <w:vAlign w:val="center"/>
+          </w:tcPr>
+          <w:p>
+            <w:r>
+              <w:t>{{ dwell_time }}</w:t>
+            </w:r>
+          </w:p>
+        </w:tc>
+      </w:tr>
+      <w:tr>
+        <w:trPr>
+          <w:trHeight w:val="340"/>
+        </w:trPr>
+        <w:tc>
+          <w:tcPr>
+            <w:tcW w:w="3243" w:type="dxa"/>
+            <w:vAlign w:val="center"/>
+          </w:tcPr>
+          <w:p>
+            <w:pPr>
               <w:rPr>
                 <w:rFonts w:ascii="Arial" w:hAnsi="Arial" w:cs="Arial"/>
                 <w:lang w:val="en-US"/>
               </w:rPr>
-              <w:t>Vrms</w:t>
-            </w:r>
-            <w:proofErr w:type="spellEnd"/>
+            </w:pPr>
             <w:r>
               <w:rPr>
                 <w:rFonts w:ascii="Arial" w:hAnsi="Arial" w:cs="Arial"/>
                 <w:lang w:val="en-US"/>
               </w:rPr>
-              <w:t xml:space="preserve"> </w:t>
-            </w:r>
-            <w:sdt>
-              <w:sdtPr>
-                <w:rPr>
-                  <w:rFonts w:ascii="Arial" w:hAnsi="Arial" w:cs="Arial"/>
-                  <w:lang w:val="en-US"/>
-                </w:rPr>
-                <w:id w:val="353315302"/>
-                <w14:checkbox>
-                  <w14:checked w14:val="0"/>
-                  <w14:checkedState w14:val="2612" w14:font="MS Gothic"/>
-                  <w14:uncheckedState w14:val="2610" w14:font="MS Gothic"/>
-                </w14:checkbox>
-              </w:sdtPr>
-              <w:sdtEndPr/>
-              <w:sdtContent>
-                <w:r>
-                  <w:rPr>
-                    <w:rFonts w:ascii="Segoe UI Symbol" w:eastAsia="MS Gothic" w:hAnsi="Segoe UI Symbol" w:cs="Segoe UI Symbol"/>
-                    <w:lang w:val="en-US"/>
-                  </w:rPr>
-                  <w:t>☐</w:t>
-                </w:r>
-              </w:sdtContent>
-            </w:sdt>
-            <w:r>
-              <w:rPr>
-                <w:rFonts w:ascii="Arial" w:hAnsi="Arial" w:cs="Arial"/>
-                <w:lang w:val="en-US"/>
-              </w:rPr>
-              <w:t xml:space="preserve"> 3 </w:t>
-            </w:r>
-            <w:proofErr w:type="spellStart"/>
-            <w:r>
-              <w:rPr>
-                <w:rFonts w:ascii="Arial" w:hAnsi="Arial" w:cs="Arial"/>
-                <w:lang w:val="en-US"/>
-              </w:rPr>
-              <w:t>Vrms</w:t>
-            </w:r>
-            <w:proofErr w:type="spellEnd"/>
+              <w:t>Modulation</w:t>
+            </w:r>
           </w:p>
+        </w:tc>
+        <w:tc>
+          <w:tcPr>
+            <w:tcW w:w="5773" w:type="dxa"/>
+            <w:gridSpan w:val="2"/>
+            <w:vAlign w:val="center"/>
+          </w:tcPr>
+          <w:p>
+            <w:r>
+              <w:t>{{ modulation }}</w:t>
+            </w:r>
+          </w:p>
+        </w:tc>
+      </w:tr>
+      <w:tr>
+        <w:trPr>
+          <w:trHeight w:val="340"/>
+        </w:trPr>
+        <w:tc>
+          <w:tcPr>
+            <w:tcW w:w="3243" w:type="dxa"/>
+            <w:vAlign w:val="center"/>
+          </w:tcPr>
           <w:p>
             <w:pPr>
               <w:spacing w:line="276" w:lineRule="auto"/>
@@ -1732,341 +1592,6 @@
                 <w:lang w:val="en-US"/>
               </w:rPr>
             </w:pPr>
-            <w:sdt>
-              <w:sdtPr>
-                <w:rPr>
-                  <w:rFonts w:ascii="Arial" w:hAnsi="Arial" w:cs="Arial"/>
-                  <w:lang w:val="en-US"/>
-                </w:rPr>
-                <w:id w:val="-1124765337"/>
-                <w14:checkbox>
-                  <w14:checked w14:val="0"/>
-                  <w14:checkedState w14:val="2612" w14:font="MS Gothic"/>
-                  <w14:uncheckedState w14:val="2610" w14:font="MS Gothic"/>
-                </w14:checkbox>
-              </w:sdtPr>
-              <w:sdtEndPr/>
-              <w:sdtContent>
-                <w:r>
-                  <w:rPr>
-                    <w:rFonts w:ascii="Segoe UI Symbol" w:eastAsia="MS Gothic" w:hAnsi="Segoe UI Symbol" w:cs="Segoe UI Symbol"/>
-                    <w:lang w:val="en-US"/>
-                  </w:rPr>
-                  <w:t>☐</w:t>
-                </w:r>
-              </w:sdtContent>
-            </w:sdt>
-            <w:r>
-              <w:rPr>
-                <w:rFonts w:ascii="Arial" w:hAnsi="Arial" w:cs="Arial"/>
-                <w:lang w:val="en-US"/>
-              </w:rPr>
-              <w:t xml:space="preserve"> 10 </w:t>
-            </w:r>
-            <w:proofErr w:type="spellStart"/>
-            <w:r>
-              <w:rPr>
-                <w:rFonts w:ascii="Arial" w:hAnsi="Arial" w:cs="Arial"/>
-                <w:lang w:val="en-US"/>
-              </w:rPr>
-              <w:t>Vrms</w:t>
-            </w:r>
-            <w:proofErr w:type="spellEnd"/>
-            <w:r>
-              <w:rPr>
-                <w:rFonts w:ascii="Arial" w:hAnsi="Arial" w:cs="Arial"/>
-                <w:lang w:val="en-US"/>
-              </w:rPr>
-              <w:t xml:space="preserve">  </w:t>
-            </w:r>
-            <w:sdt>
-              <w:sdtPr>
-                <w:rPr>
-                  <w:rFonts w:ascii="Arial" w:hAnsi="Arial" w:cs="Arial"/>
-                  <w:lang w:val="en-US"/>
-                </w:rPr>
-                <w:id w:val="-566571278"/>
-                <w14:checkbox>
-                  <w14:checked w14:val="0"/>
-                  <w14:checkedState w14:val="2612" w14:font="MS Gothic"/>
-                  <w14:uncheckedState w14:val="2610" w14:font="MS Gothic"/>
-                </w14:checkbox>
-              </w:sdtPr>
-              <w:sdtEndPr/>
-              <w:sdtContent>
-                <w:r>
-                  <w:rPr>
-                    <w:rFonts w:ascii="Segoe UI Symbol" w:eastAsia="MS Gothic" w:hAnsi="Segoe UI Symbol" w:cs="Segoe UI Symbol"/>
-                    <w:lang w:val="en-US"/>
-                  </w:rPr>
-                  <w:t>☐</w:t>
-                </w:r>
-              </w:sdtContent>
-            </w:sdt>
-            <w:r>
-              <w:rPr>
-                <w:rFonts w:ascii="Arial" w:hAnsi="Arial" w:cs="Arial"/>
-                <w:lang w:val="en-US"/>
-              </w:rPr>
-              <w:t xml:space="preserve"> Custom___</w:t>
-            </w:r>
-          </w:p>
-        </w:tc>
-      </w:tr>
-      <w:tr>
-        <w:trPr>
-          <w:trHeight w:val="340"/>
-        </w:trPr>
-        <w:tc>
-          <w:tcPr>
-            <w:tcW w:w="3243" w:type="dxa"/>
-            <w:vAlign w:val="center"/>
-          </w:tcPr>
-          <w:p>
-            <w:pPr>
-              <w:spacing w:line="276" w:lineRule="auto"/>
-              <w:rPr>
-                <w:rFonts w:ascii="Arial" w:hAnsi="Arial" w:cs="Arial"/>
-                <w:lang w:val="en-US"/>
-              </w:rPr>
-            </w:pPr>
-            <w:r>
-              <w:rPr>
-                <w:rFonts w:ascii="Arial" w:hAnsi="Arial" w:cs="Arial"/>
-                <w:lang w:val="en-US"/>
-              </w:rPr>
-              <w:t>Frequency Range</w:t>
-            </w:r>
-          </w:p>
-        </w:tc>
-        <w:tc>
-          <w:tcPr>
-            <w:tcW w:w="5773" w:type="dxa"/>
-            <w:gridSpan w:val="2"/>
-            <w:vAlign w:val="center"/>
-          </w:tcPr>
-          <w:p>
-            <w:r/>
-            <w:r>
-              <w:t>{{ frequency_range }}</w:t>
-            </w:r>
-          </w:p>
-        </w:tc>
-      </w:tr>
-      <w:tr>
-        <w:trPr>
-          <w:trHeight w:val="340"/>
-        </w:trPr>
-        <w:tc>
-          <w:tcPr>
-            <w:tcW w:w="3243" w:type="dxa"/>
-            <w:vAlign w:val="center"/>
-          </w:tcPr>
-          <w:p>
-            <w:pPr>
-              <w:spacing w:line="276" w:lineRule="auto"/>
-              <w:rPr>
-                <w:rFonts w:ascii="Arial" w:hAnsi="Arial" w:cs="Arial"/>
-                <w:lang w:val="en-US"/>
-              </w:rPr>
-            </w:pPr>
-            <w:r>
-              <w:rPr>
-                <w:rFonts w:ascii="Arial" w:hAnsi="Arial" w:cs="Arial"/>
-                <w:lang w:val="en-US"/>
-              </w:rPr>
-              <w:t>Frequency Step size</w:t>
-            </w:r>
-          </w:p>
-        </w:tc>
-        <w:tc>
-          <w:tcPr>
-            <w:tcW w:w="5773" w:type="dxa"/>
-            <w:gridSpan w:val="2"/>
-            <w:vAlign w:val="center"/>
-          </w:tcPr>
-          <w:p>
-            <w:r/>
-            <w:r>
-              <w:t>{{ frequency_step_size }}</w:t>
-            </w:r>
-          </w:p>
-        </w:tc>
-      </w:tr>
-      <w:tr>
-        <w:trPr>
-          <w:trHeight w:val="340"/>
-        </w:trPr>
-        <w:tc>
-          <w:tcPr>
-            <w:tcW w:w="3243" w:type="dxa"/>
-            <w:vAlign w:val="center"/>
-          </w:tcPr>
-          <w:p>
-            <w:pPr>
-              <w:spacing w:line="276" w:lineRule="auto"/>
-              <w:rPr>
-                <w:rFonts w:ascii="Arial" w:hAnsi="Arial" w:cs="Arial"/>
-                <w:lang w:val="en-US"/>
-              </w:rPr>
-            </w:pPr>
-            <w:r>
-              <w:rPr>
-                <w:rFonts w:ascii="Arial" w:hAnsi="Arial" w:cs="Arial"/>
-                <w:lang w:val="en-US"/>
-              </w:rPr>
-              <w:t>Dwell Time</w:t>
-            </w:r>
-          </w:p>
-        </w:tc>
-        <w:tc>
-          <w:tcPr>
-            <w:tcW w:w="5773" w:type="dxa"/>
-            <w:gridSpan w:val="2"/>
-            <w:vAlign w:val="center"/>
-          </w:tcPr>
-          <w:p>
-            <w:r/>
-            <w:r>
-              <w:t>{{ dwell_time }}</w:t>
-            </w:r>
-          </w:p>
-        </w:tc>
-      </w:tr>
-      <w:tr>
-        <w:trPr>
-          <w:trHeight w:val="340"/>
-        </w:trPr>
-        <w:tc>
-          <w:tcPr>
-            <w:tcW w:w="3243" w:type="dxa"/>
-            <w:vAlign w:val="center"/>
-          </w:tcPr>
-          <w:p>
-            <w:pPr>
-              <w:rPr>
-                <w:rFonts w:ascii="Arial" w:hAnsi="Arial" w:cs="Arial"/>
-                <w:lang w:val="en-US"/>
-              </w:rPr>
-            </w:pPr>
-            <w:r>
-              <w:rPr>
-                <w:rFonts w:ascii="Arial" w:hAnsi="Arial" w:cs="Arial"/>
-                <w:lang w:val="en-US"/>
-              </w:rPr>
-              <w:t>Modulation</w:t>
-            </w:r>
-          </w:p>
-        </w:tc>
-        <w:tc>
-          <w:tcPr>
-            <w:tcW w:w="5773" w:type="dxa"/>
-            <w:gridSpan w:val="2"/>
-            <w:vAlign w:val="center"/>
-          </w:tcPr>
-          <w:p>
-            <w:r/>
-            <w:r>
-              <w:t>{{ modulation }}</w:t>
-            </w:r>
-          </w:p>
-        </w:tc>
-      </w:tr>
-      <w:tr>
-        <w:trPr>
-          <w:trHeight w:val="340"/>
-        </w:trPr>
-        <w:tc>
-          <w:tcPr>
-            <w:tcW w:w="3243" w:type="dxa"/>
-            <w:vAlign w:val="center"/>
-          </w:tcPr>
-          <w:p>
-            <w:pPr>
-              <w:rPr>
-                <w:rFonts w:ascii="Arial" w:hAnsi="Arial" w:cs="Arial"/>
-                <w:lang w:val="en-US"/>
-              </w:rPr>
-            </w:pPr>
-            <w:r>
-              <w:rPr>
-                <w:rFonts w:ascii="Arial" w:hAnsi="Arial" w:cs="Arial"/>
-                <w:lang w:val="en-US"/>
-              </w:rPr>
-              <w:t>Modulation depth</w:t>
-            </w:r>
-          </w:p>
-        </w:tc>
-        <w:tc>
-          <w:tcPr>
-            <w:tcW w:w="5773" w:type="dxa"/>
-            <w:gridSpan w:val="2"/>
-            <w:vAlign w:val="center"/>
-          </w:tcPr>
-          <w:p>
-            <w:r/>
-            <w:r>
-              <w:t>{{ modulation_depth }}</w:t>
-            </w:r>
-          </w:p>
-        </w:tc>
-      </w:tr>
-      <w:tr>
-        <w:trPr>
-          <w:trHeight w:val="340"/>
-        </w:trPr>
-        <w:tc>
-          <w:tcPr>
-            <w:tcW w:w="3243" w:type="dxa"/>
-            <w:vAlign w:val="center"/>
-          </w:tcPr>
-          <w:p>
-            <w:pPr>
-              <w:rPr>
-                <w:rFonts w:ascii="Arial" w:hAnsi="Arial" w:cs="Arial"/>
-                <w:lang w:val="en-US"/>
-              </w:rPr>
-            </w:pPr>
-            <w:r>
-              <w:rPr>
-                <w:rFonts w:ascii="Arial" w:hAnsi="Arial" w:cs="Arial"/>
-                <w:lang w:val="en-US"/>
-              </w:rPr>
-              <w:t>Modulation Frequency</w:t>
-            </w:r>
-          </w:p>
-        </w:tc>
-        <w:tc>
-          <w:tcPr>
-            <w:tcW w:w="5773" w:type="dxa"/>
-            <w:gridSpan w:val="2"/>
-            <w:vAlign w:val="center"/>
-          </w:tcPr>
-          <w:p>
-            <w:r/>
-            <w:r>
-              <w:t>{{ modulation_frequency }}</w:t>
-            </w:r>
-          </w:p>
-        </w:tc>
-      </w:tr>
-      <w:tr>
-        <w:trPr>
-          <w:trHeight w:val="340"/>
-        </w:trPr>
-        <w:tc>
-          <w:tcPr>
-            <w:tcW w:w="3243" w:type="dxa"/>
-            <w:vAlign w:val="center"/>
-          </w:tcPr>
-          <w:p>
-            <w:pPr>
-              <w:spacing w:line="276" w:lineRule="auto"/>
-              <w:rPr>
-                <w:rFonts w:ascii="Arial" w:hAnsi="Arial" w:cs="Arial"/>
-                <w:lang w:val="en-US"/>
-              </w:rPr>
-            </w:pPr>
             <w:r>
               <w:rPr>
                 <w:rFonts w:ascii="Arial" w:hAnsi="Arial" w:cs="Arial"/>
@@ -2090,7 +1615,6 @@
             <w:vAlign w:val="center"/>
           </w:tcPr>
           <w:p>
-            <w:r/>
             <w:r>
               <w:t>{{ test_mode }}</w:t>
             </w:r>
@@ -2187,7 +1711,6 @@
             <w:vAlign w:val="center"/>
           </w:tcPr>
           <w:p>
-            <w:r/>
             <w:r>
               <w:t>{{ eut_modification_state }}</w:t>
             </w:r>
@@ -2222,25 +1745,13 @@
         </w:tc>
         <w:tc>
           <w:tcPr>
-            <w:tcW w:w="2886" w:type="dxa"/>
+            <w:tcW w:w="5773" w:type="dxa"/>
+            <w:gridSpan w:val="2"/>
             <w:vAlign w:val="center"/>
           </w:tcPr>
           <w:p>
-            <w:r/>
-            <w:r>
-              <w:t>{{ eut_configuration_1_vrms_3_vrms_10_vrms_custom }}</w:t>
-            </w:r>
-          </w:p>
-        </w:tc>
-        <w:tc>
-          <w:tcPr>
-            <w:tcW w:w="2887" w:type="dxa"/>
-            <w:vAlign w:val="center"/>
-          </w:tcPr>
-          <w:p>
-            <w:r/>
-            <w:r>
-              <w:t>{{ eut_configuration_1_vrms_3_vrms_10_vrms_custom_2 }}</w:t>
+            <w:r>
+              <w:t>{{ eut_configuration }}</w:t>
             </w:r>
           </w:p>
         </w:tc>
@@ -2278,7 +1789,6 @@
             <w:vAlign w:val="center"/>
           </w:tcPr>
           <w:p>
-            <w:r/>
             <w:r>
               <w:t>{{ eut_input_voltage_frequency }}</w:t>
             </w:r>
@@ -2318,7 +1828,6 @@
             <w:vAlign w:val="center"/>
           </w:tcPr>
           <w:p>
-            <w:r/>
             <w:r>
               <w:t>{{ ambient_temperature }}</w:t>
             </w:r>
@@ -2358,7 +1867,6 @@
             <w:vAlign w:val="center"/>
           </w:tcPr>
           <w:p>
-            <w:r/>
             <w:r>
               <w:t>{{ relative_humidity }}</w:t>
             </w:r>
@@ -2398,7 +1906,6 @@
             <w:vAlign w:val="center"/>
           </w:tcPr>
           <w:p>
-            <w:r/>
             <w:r>
               <w:t>{{ test_date }}</w:t>
             </w:r>
@@ -2438,7 +1945,6 @@
             <w:vAlign w:val="center"/>
           </w:tcPr>
           <w:p>
-            <w:r/>
             <w:r>
               <w:t>{{ tested_by }}</w:t>
             </w:r>
@@ -2684,421 +2190,6 @@
         </w:rPr>
       </w:pPr>
     </w:p>
-    <w:tbl>
-      <w:tblPr>
-        <w:tblW w:w="8700" w:type="dxa"/>
-        <w:tblLook w:val="04A0" w:firstRow="1" w:lastRow="0" w:firstColumn="1" w:lastColumn="0" w:noHBand="0" w:noVBand="1"/>
-      </w:tblPr>
-      <w:tblGrid>
-        <w:gridCol w:w="1720"/>
-        <w:gridCol w:w="1720"/>
-        <w:gridCol w:w="1820"/>
-        <w:gridCol w:w="1720"/>
-        <w:gridCol w:w="1720"/>
-      </w:tblGrid>
-      <w:tr>
-        <w:trPr>
-          <w:trHeight w:val="290"/>
-        </w:trPr>
-        <w:tc>
-          <w:tcPr>
-            <w:tcW w:w="1720" w:type="dxa"/>
-            <w:tcBorders>
-              <w:top w:val="single" w:sz="4" w:space="0" w:color="auto"/>
-              <w:left w:val="single" w:sz="4" w:space="0" w:color="auto"/>
-              <w:bottom w:val="single" w:sz="4" w:space="0" w:color="auto"/>
-              <w:right w:val="single" w:sz="4" w:space="0" w:color="auto"/>
-            </w:tcBorders>
-            <w:noWrap/>
-            <w:vAlign w:val="center"/>
-            <w:hideMark/>
-          </w:tcPr>
-          <w:p>
-            <w:pPr>
-              <w:spacing w:after="0" w:line="240" w:lineRule="auto"/>
-              <w:jc w:val="center"/>
-              <w:rPr>
-                <w:rFonts w:ascii="Arial" w:eastAsia="Times New Roman" w:hAnsi="Arial" w:cs="Arial"/>
-                <w:b/>
-                <w:bCs/>
-                <w:color w:val="000000"/>
-                <w:kern w:val="0"/>
-                <w:lang w:eastAsia="en-IN"/>
-                <w14:ligatures w14:val="none"/>
-              </w:rPr>
-            </w:pPr>
-            <w:r>
-              <w:rPr>
-                <w:rFonts w:ascii="Arial" w:eastAsia="Times New Roman" w:hAnsi="Arial" w:cs="Arial"/>
-                <w:b/>
-                <w:bCs/>
-                <w:color w:val="000000"/>
-                <w:kern w:val="0"/>
-                <w:lang w:eastAsia="en-IN"/>
-                <w14:ligatures w14:val="none"/>
-              </w:rPr>
-              <w:t>Frequency range (MHz)</w:t>
-            </w:r>
-          </w:p>
-        </w:tc>
-        <w:tc>
-          <w:tcPr>
-            <w:tcW w:w="1720" w:type="dxa"/>
-            <w:tcBorders>
-              <w:top w:val="single" w:sz="4" w:space="0" w:color="auto"/>
-              <w:left w:val="nil"/>
-              <w:bottom w:val="single" w:sz="4" w:space="0" w:color="auto"/>
-              <w:right w:val="single" w:sz="4" w:space="0" w:color="auto"/>
-            </w:tcBorders>
-            <w:noWrap/>
-            <w:vAlign w:val="center"/>
-            <w:hideMark/>
-          </w:tcPr>
-          <w:p>
-            <w:pPr>
-              <w:spacing w:after="0" w:line="240" w:lineRule="auto"/>
-              <w:jc w:val="center"/>
-              <w:rPr>
-                <w:rFonts w:ascii="Arial" w:eastAsia="Times New Roman" w:hAnsi="Arial" w:cs="Arial"/>
-                <w:b/>
-                <w:bCs/>
-                <w:color w:val="000000"/>
-                <w:kern w:val="0"/>
-                <w:lang w:eastAsia="en-IN"/>
-                <w14:ligatures w14:val="none"/>
-              </w:rPr>
-            </w:pPr>
-            <w:r>
-              <w:rPr>
-                <w:rFonts w:ascii="Arial" w:eastAsia="Times New Roman" w:hAnsi="Arial" w:cs="Arial"/>
-                <w:b/>
-                <w:bCs/>
-                <w:color w:val="000000"/>
-                <w:kern w:val="0"/>
-                <w:lang w:eastAsia="en-IN"/>
-                <w14:ligatures w14:val="none"/>
-              </w:rPr>
-              <w:t>Port Name</w:t>
-            </w:r>
-          </w:p>
-        </w:tc>
-        <w:tc>
-          <w:tcPr>
-            <w:tcW w:w="1820" w:type="dxa"/>
-            <w:tcBorders>
-              <w:top w:val="single" w:sz="4" w:space="0" w:color="auto"/>
-              <w:left w:val="nil"/>
-              <w:bottom w:val="single" w:sz="4" w:space="0" w:color="auto"/>
-              <w:right w:val="single" w:sz="4" w:space="0" w:color="auto"/>
-            </w:tcBorders>
-            <w:noWrap/>
-            <w:vAlign w:val="center"/>
-            <w:hideMark/>
-          </w:tcPr>
-          <w:p>
-            <w:r/>
-            <w:r>
-              <w:t>{{ frequency_range_port_name_col_2 }}</w:t>
-            </w:r>
-          </w:p>
-        </w:tc>
-        <w:tc>
-          <w:tcPr>
-            <w:tcW w:w="1720" w:type="dxa"/>
-            <w:tcBorders>
-              <w:top w:val="single" w:sz="4" w:space="0" w:color="auto"/>
-              <w:left w:val="nil"/>
-              <w:bottom w:val="single" w:sz="4" w:space="0" w:color="auto"/>
-              <w:right w:val="single" w:sz="4" w:space="0" w:color="auto"/>
-            </w:tcBorders>
-            <w:noWrap/>
-            <w:vAlign w:val="center"/>
-            <w:hideMark/>
-          </w:tcPr>
-          <w:p>
-            <w:r/>
-            <w:r>
-              <w:t>{{ frequency_range_port_name_col_3 }}</w:t>
-            </w:r>
-          </w:p>
-        </w:tc>
-        <w:tc>
-          <w:tcPr>
-            <w:tcW w:w="1720" w:type="dxa"/>
-            <w:tcBorders>
-              <w:top w:val="single" w:sz="4" w:space="0" w:color="auto"/>
-              <w:left w:val="nil"/>
-              <w:bottom w:val="single" w:sz="4" w:space="0" w:color="auto"/>
-              <w:right w:val="single" w:sz="4" w:space="0" w:color="auto"/>
-            </w:tcBorders>
-            <w:noWrap/>
-            <w:vAlign w:val="center"/>
-            <w:hideMark/>
-          </w:tcPr>
-          <w:p>
-            <w:r/>
-            <w:r>
-              <w:t>{{ frequency_range_port_name_col_4 }}</w:t>
-            </w:r>
-          </w:p>
-        </w:tc>
-      </w:tr>
-      <w:tr>
-        <w:trPr>
-          <w:trHeight w:val="290"/>
-        </w:trPr>
-        <w:tc>
-          <w:tcPr>
-            <w:tcW w:w="1720" w:type="dxa"/>
-            <w:tcBorders>
-              <w:top w:val="nil"/>
-              <w:left w:val="single" w:sz="4" w:space="0" w:color="auto"/>
-              <w:bottom w:val="single" w:sz="4" w:space="0" w:color="auto"/>
-              <w:right w:val="single" w:sz="4" w:space="0" w:color="auto"/>
-            </w:tcBorders>
-            <w:noWrap/>
-            <w:vAlign w:val="center"/>
-            <w:hideMark/>
-          </w:tcPr>
-          <w:p>
-            <w:pPr>
-              <w:spacing w:after="0" w:line="240" w:lineRule="auto"/>
-              <w:jc w:val="center"/>
-              <w:rPr>
-                <w:rFonts w:ascii="Arial" w:eastAsia="Times New Roman" w:hAnsi="Arial" w:cs="Arial"/>
-                <w:color w:val="000000"/>
-                <w:kern w:val="0"/>
-                <w:lang w:eastAsia="en-IN"/>
-                <w14:ligatures w14:val="none"/>
-              </w:rPr>
-            </w:pPr>
-            <w:r>
-              <w:rPr>
-                <w:rFonts w:ascii="Arial" w:eastAsia="Times New Roman" w:hAnsi="Arial" w:cs="Arial"/>
-                <w:color w:val="000000"/>
-                <w:kern w:val="0"/>
-                <w:lang w:eastAsia="en-IN"/>
-                <w14:ligatures w14:val="none"/>
-              </w:rPr>
-              <w:t> 0.15 to 80</w:t>
-            </w:r>
-          </w:p>
-        </w:tc>
-        <w:tc>
-          <w:tcPr>
-            <w:tcW w:w="1720" w:type="dxa"/>
-            <w:tcBorders>
-              <w:top w:val="nil"/>
-              <w:left w:val="nil"/>
-              <w:bottom w:val="single" w:sz="4" w:space="0" w:color="auto"/>
-              <w:right w:val="single" w:sz="4" w:space="0" w:color="auto"/>
-            </w:tcBorders>
-            <w:noWrap/>
-            <w:vAlign w:val="center"/>
-            <w:hideMark/>
-          </w:tcPr>
-          <w:p>
-            <w:r/>
-            <w:r>
-              <w:t>{{ f_0_15_to_80_col_1 }}</w:t>
-            </w:r>
-          </w:p>
-        </w:tc>
-        <w:tc>
-          <w:tcPr>
-            <w:tcW w:w="1820" w:type="dxa"/>
-            <w:tcBorders>
-              <w:top w:val="nil"/>
-              <w:left w:val="nil"/>
-              <w:bottom w:val="single" w:sz="4" w:space="0" w:color="auto"/>
-              <w:right w:val="single" w:sz="4" w:space="0" w:color="auto"/>
-            </w:tcBorders>
-            <w:noWrap/>
-            <w:vAlign w:val="center"/>
-            <w:hideMark/>
-          </w:tcPr>
-          <w:p>
-            <w:r/>
-            <w:r>
-              <w:t>{{ f_0_15_to_80_col_2 }}</w:t>
-            </w:r>
-          </w:p>
-        </w:tc>
-        <w:tc>
-          <w:tcPr>
-            <w:tcW w:w="1720" w:type="dxa"/>
-            <w:tcBorders>
-              <w:top w:val="nil"/>
-              <w:left w:val="nil"/>
-              <w:bottom w:val="single" w:sz="4" w:space="0" w:color="auto"/>
-              <w:right w:val="single" w:sz="4" w:space="0" w:color="auto"/>
-            </w:tcBorders>
-            <w:noWrap/>
-            <w:vAlign w:val="center"/>
-            <w:hideMark/>
-          </w:tcPr>
-          <w:p>
-            <w:r/>
-            <w:r>
-              <w:t>{{ f_0_15_to_80_col_3 }}</w:t>
-            </w:r>
-          </w:p>
-        </w:tc>
-        <w:tc>
-          <w:tcPr>
-            <w:tcW w:w="1720" w:type="dxa"/>
-            <w:tcBorders>
-              <w:top w:val="nil"/>
-              <w:left w:val="nil"/>
-              <w:bottom w:val="single" w:sz="4" w:space="0" w:color="auto"/>
-              <w:right w:val="single" w:sz="4" w:space="0" w:color="auto"/>
-            </w:tcBorders>
-            <w:noWrap/>
-            <w:vAlign w:val="center"/>
-            <w:hideMark/>
-          </w:tcPr>
-          <w:p>
-            <w:r/>
-            <w:r>
-              <w:t>{{ f_0_15_to_80_col_4 }}</w:t>
-            </w:r>
-          </w:p>
-        </w:tc>
-      </w:tr>
-      <w:tr>
-        <w:trPr>
-          <w:trHeight w:val="283"/>
-        </w:trPr>
-        <w:tc>
-          <w:tcPr>
-            <w:tcW w:w="1720" w:type="dxa"/>
-            <w:tcBorders>
-              <w:top w:val="nil"/>
-              <w:left w:val="single" w:sz="4" w:space="0" w:color="auto"/>
-              <w:bottom w:val="single" w:sz="4" w:space="0" w:color="auto"/>
-              <w:right w:val="single" w:sz="4" w:space="0" w:color="auto"/>
-            </w:tcBorders>
-            <w:noWrap/>
-            <w:vAlign w:val="center"/>
-            <w:hideMark/>
-          </w:tcPr>
-          <w:p>
-            <w:pPr>
-              <w:spacing w:after="0" w:line="240" w:lineRule="auto"/>
-              <w:jc w:val="center"/>
-              <w:rPr>
-                <w:rFonts w:ascii="Arial" w:eastAsia="Times New Roman" w:hAnsi="Arial" w:cs="Arial"/>
-                <w:color w:val="000000"/>
-                <w:kern w:val="0"/>
-                <w:lang w:eastAsia="en-IN"/>
-                <w14:ligatures w14:val="none"/>
-              </w:rPr>
-            </w:pPr>
-            <w:r>
-              <w:rPr>
-                <w:rFonts w:ascii="Arial" w:eastAsia="Times New Roman" w:hAnsi="Arial" w:cs="Arial"/>
-                <w:color w:val="0070C0"/>
-                <w:kern w:val="0"/>
-                <w:lang w:eastAsia="en-IN"/>
-                <w14:ligatures w14:val="none"/>
-              </w:rPr>
-              <w:t>ISM Band </w:t>
-            </w:r>
-            <w:r>
-              <w:rPr>
-                <w:rFonts w:ascii="Arial" w:eastAsia="Times New Roman" w:hAnsi="Arial" w:cs="Arial"/>
-                <w:color w:val="0070C0"/>
-                <w:kern w:val="0"/>
-                <w:vertAlign w:val="superscript"/>
-                <w:lang w:eastAsia="en-IN"/>
-                <w14:ligatures w14:val="none"/>
-              </w:rPr>
-              <w:t>(1)</w:t>
-            </w:r>
-          </w:p>
-        </w:tc>
-        <w:tc>
-          <w:tcPr>
-            <w:tcW w:w="1720" w:type="dxa"/>
-            <w:tcBorders>
-              <w:top w:val="nil"/>
-              <w:left w:val="nil"/>
-              <w:bottom w:val="single" w:sz="4" w:space="0" w:color="auto"/>
-              <w:right w:val="single" w:sz="4" w:space="0" w:color="auto"/>
-            </w:tcBorders>
-            <w:noWrap/>
-            <w:vAlign w:val="center"/>
-            <w:hideMark/>
-          </w:tcPr>
-          <w:p>
-            <w:r/>
-            <w:r>
-              <w:t>{{ ism_band_col_1 }}</w:t>
-            </w:r>
-          </w:p>
-        </w:tc>
-        <w:tc>
-          <w:tcPr>
-            <w:tcW w:w="1820" w:type="dxa"/>
-            <w:tcBorders>
-              <w:top w:val="nil"/>
-              <w:left w:val="nil"/>
-              <w:bottom w:val="single" w:sz="4" w:space="0" w:color="auto"/>
-              <w:right w:val="single" w:sz="4" w:space="0" w:color="auto"/>
-            </w:tcBorders>
-            <w:noWrap/>
-            <w:vAlign w:val="center"/>
-            <w:hideMark/>
-          </w:tcPr>
-          <w:p>
-            <w:r/>
-            <w:r>
-              <w:t>{{ ism_band_col_2 }}</w:t>
-            </w:r>
-          </w:p>
-        </w:tc>
-        <w:tc>
-          <w:tcPr>
-            <w:tcW w:w="1720" w:type="dxa"/>
-            <w:tcBorders>
-              <w:top w:val="nil"/>
-              <w:left w:val="nil"/>
-              <w:bottom w:val="single" w:sz="4" w:space="0" w:color="auto"/>
-              <w:right w:val="single" w:sz="4" w:space="0" w:color="auto"/>
-            </w:tcBorders>
-            <w:noWrap/>
-            <w:vAlign w:val="center"/>
-            <w:hideMark/>
-          </w:tcPr>
-          <w:p>
-            <w:r/>
-            <w:r>
-              <w:t>{{ ism_band_col_3 }}</w:t>
-            </w:r>
-          </w:p>
-        </w:tc>
-        <w:tc>
-          <w:tcPr>
-            <w:tcW w:w="1720" w:type="dxa"/>
-            <w:tcBorders>
-              <w:top w:val="nil"/>
-              <w:left w:val="nil"/>
-              <w:bottom w:val="single" w:sz="4" w:space="0" w:color="auto"/>
-              <w:right w:val="single" w:sz="4" w:space="0" w:color="auto"/>
-            </w:tcBorders>
-            <w:noWrap/>
-            <w:vAlign w:val="center"/>
-            <w:hideMark/>
-          </w:tcPr>
-          <w:p>
-            <w:r/>
-            <w:r>
-              <w:t>{{ ism_band_col_4 }}</w:t>
-            </w:r>
-          </w:p>
-        </w:tc>
-      </w:tr>
-    </w:tbl>
     <w:p>
       <w:pPr>
         <w:pStyle w:val="ListParagraph"/>

</xml_diff>

<commit_message>
Fold in ThermoDocGenExtended uncommitted datasheet work (your latest engine)
Overlays the current working-tree datasheet_gen from ThermoDocGenExtended
(uncommitted at HEAD 94bc340): generator/generic_generator/generic_service/
layout(+88)/service, ds_image_editor.js, ce_form/generic_form, CRF schema, and
5 refreshed .docx templates (CRF/EFT/SURGE/VOLTAGEDIPS/VOLTAGEFLICKER).
This makes the merged datasheet engine match your actual latest on-disk work.
</commit_message>
<xml_diff>
--- a/datasheet_gen/word_templates/CRF.docx
+++ b/datasheet_gen/word_templates/CRF.docx
@@ -2908,7 +2908,7 @@
           <w:szCs w:val="20"/>
           <w:u w:val="none"/>
         </w:rPr>
-        <w:t>Photo</w:t>
+        <w:t>{{ img_photo_1_caption }}</w:t>
       </w:r>
       <w:r>
         <w:rPr>
@@ -2922,7 +2922,6 @@
           <w:color w:val="auto"/>
           <w:u w:val="none"/>
         </w:rPr>
-        <w:t xml:space="preserve"> </w:t>
       </w:r>
       <w:r>
         <w:rPr>
@@ -2938,7 +2937,6 @@
           <w:szCs w:val="20"/>
           <w:u w:val="none"/>
         </w:rPr>
-        <w:fldChar w:fldCharType="begin"/>
       </w:r>
       <w:r>
         <w:rPr>
@@ -2954,7 +2952,6 @@
           <w:szCs w:val="20"/>
           <w:u w:val="none"/>
         </w:rPr>
-        <w:instrText xml:space="preserve"> SEQ Photo \* ARABIC </w:instrText>
       </w:r>
       <w:r>
         <w:rPr>
@@ -2970,7 +2967,6 @@
           <w:szCs w:val="20"/>
           <w:u w:val="none"/>
         </w:rPr>
-        <w:fldChar w:fldCharType="separate"/>
       </w:r>
       <w:r>
         <w:rPr>
@@ -2986,7 +2982,6 @@
           <w:szCs w:val="20"/>
           <w:u w:val="none"/>
         </w:rPr>
-        <w:t>1</w:t>
       </w:r>
       <w:r>
         <w:rPr>
@@ -3002,7 +2997,6 @@
           <w:szCs w:val="20"/>
           <w:u w:val="none"/>
         </w:rPr>
-        <w:fldChar w:fldCharType="end"/>
       </w:r>
       <w:r>
         <w:rPr>
@@ -3018,7 +3012,6 @@
           <w:szCs w:val="20"/>
           <w:u w:val="none"/>
         </w:rPr>
-        <w:t>:</w:t>
       </w:r>
       <w:r>
         <w:rPr>
@@ -3032,7 +3025,6 @@
           <w:szCs w:val="20"/>
           <w:u w:val="none"/>
         </w:rPr>
-        <w:t xml:space="preserve"> </w:t>
       </w:r>
       <w:r>
         <w:rPr>
@@ -3045,7 +3037,6 @@
           <w:sz w:val="20"/>
           <w:szCs w:val="20"/>
         </w:rPr>
-        <w:t>CRF test setup</w:t>
       </w:r>
       <w:r>
         <w:rPr>
@@ -3058,7 +3049,6 @@
           <w:sz w:val="20"/>
           <w:szCs w:val="20"/>
         </w:rPr>
-        <w:t xml:space="preserve"> -</w:t>
       </w:r>
       <w:r>
         <w:rPr>
@@ -3071,7 +3061,6 @@
           <w:sz w:val="20"/>
           <w:szCs w:val="20"/>
         </w:rPr>
-        <w:t xml:space="preserve"> Power Line</w:t>
       </w:r>
       <w:bookmarkEnd w:id="135"/>
     </w:p>
@@ -3126,7 +3115,7 @@
           <w:szCs w:val="20"/>
           <w:u w:val="none"/>
         </w:rPr>
-        <w:t>Photo</w:t>
+        <w:t>{{ img_photo_2_caption }}</w:t>
       </w:r>
       <w:r>
         <w:rPr>
@@ -3140,7 +3129,6 @@
           <w:color w:val="auto"/>
           <w:u w:val="none"/>
         </w:rPr>
-        <w:t xml:space="preserve"> </w:t>
       </w:r>
       <w:r>
         <w:rPr>
@@ -3156,7 +3144,6 @@
           <w:szCs w:val="20"/>
           <w:u w:val="none"/>
         </w:rPr>
-        <w:fldChar w:fldCharType="begin"/>
       </w:r>
       <w:r>
         <w:rPr>
@@ -3172,7 +3159,6 @@
           <w:szCs w:val="20"/>
           <w:u w:val="none"/>
         </w:rPr>
-        <w:instrText xml:space="preserve"> SEQ Photo \* ARABIC </w:instrText>
       </w:r>
       <w:r>
         <w:rPr>
@@ -3188,7 +3174,6 @@
           <w:szCs w:val="20"/>
           <w:u w:val="none"/>
         </w:rPr>
-        <w:fldChar w:fldCharType="separate"/>
       </w:r>
       <w:r>
         <w:rPr>
@@ -3204,7 +3189,6 @@
           <w:szCs w:val="20"/>
           <w:u w:val="none"/>
         </w:rPr>
-        <w:t>2</w:t>
       </w:r>
       <w:r>
         <w:rPr>
@@ -3220,7 +3204,6 @@
           <w:szCs w:val="20"/>
           <w:u w:val="none"/>
         </w:rPr>
-        <w:fldChar w:fldCharType="end"/>
       </w:r>
       <w:r>
         <w:rPr>
@@ -3236,7 +3219,6 @@
           <w:szCs w:val="20"/>
           <w:u w:val="none"/>
         </w:rPr>
-        <w:t>:</w:t>
       </w:r>
       <w:r>
         <w:rPr>
@@ -3249,7 +3231,6 @@
           <w:sz w:val="20"/>
           <w:szCs w:val="20"/>
         </w:rPr>
-        <w:t xml:space="preserve"> CRF test setup</w:t>
       </w:r>
       <w:r>
         <w:rPr>
@@ -3262,7 +3243,6 @@
           <w:sz w:val="20"/>
           <w:szCs w:val="20"/>
         </w:rPr>
-        <w:t xml:space="preserve"> -</w:t>
       </w:r>
       <w:r>
         <w:rPr>
@@ -3275,7 +3255,6 @@
           <w:sz w:val="20"/>
           <w:szCs w:val="20"/>
         </w:rPr>
-        <w:t xml:space="preserve"> Signal Line</w:t>
       </w:r>
       <w:bookmarkEnd w:id="136"/>
     </w:p>

</xml_diff>